<commit_message>
final report with added yt link
</commit_message>
<xml_diff>
--- a/AR FINAL PROJECT REPORT.docx
+++ b/AR FINAL PROJECT REPORT.docx
@@ -93,7 +93,10 @@
     </w:p>
     <w:p>
       <w:r>
-        <w:t>Project Demo Video URL: __________________________________________</w:t>
+        <w:t xml:space="preserve">Project Demo Video URL: </w:t>
+      </w:r>
+      <w:r>
+        <w:t>https://www.youtube.com/shorts/YMFg_DXfqsQ</w:t>
       </w:r>
     </w:p>
     <w:p/>

</xml_diff>